<commit_message>
Align PyTorch MLP wrappers with experiment line examples
</commit_message>
<xml_diff>
--- a/examples/classification/doc/torch_cla_mlp.docx
+++ b/examples/classification/doc/torch_cla_mlp.docx
@@ -2,13 +2,13 @@
 <file path=word/document.xml><?xml version="1.0" encoding="utf-8"?>
 <w:document xmlns:w="http://schemas.openxmlformats.org/wordprocessingml/2006/main" xmlns:m="http://schemas.openxmlformats.org/officeDocument/2006/math" xmlns:r="http://schemas.openxmlformats.org/officeDocument/2006/relationships" xmlns:o="urn:schemas-microsoft-com:office:office" xmlns:v="urn:schemas-microsoft-com:vml" xmlns:w10="urn:schemas-microsoft-com:office:word" xmlns:a="http://schemas.openxmlformats.org/drawingml/2006/main" xmlns:pic="http://schemas.openxmlformats.org/drawingml/2006/picture" xmlns:wp="http://schemas.openxmlformats.org/drawingml/2006/wordprocessingDrawing">
   <w:body>
-    <w:bookmarkStart w:id="9" w:name="pytorch-mlp-classifier"/>
+    <w:bookmarkStart w:id="9" w:name="X9e59e936da88459129eb3a2fb1e330800e181c2"/>
     <w:p>
       <w:pPr>
         <w:pStyle w:val="Heading2"/>
       </w:pPr>
       <w:r>
-        <w:t xml:space="preserve">PyTorch MLP Classifier</w:t>
+        <w:t xml:space="preserve">PyTorch Multi-Layer Perceptron (MLP) Classifier</w:t>
       </w:r>
     </w:p>
     <w:p>
@@ -16,7 +16,7 @@
         <w:pStyle w:val="FirstParagraph"/>
       </w:pPr>
       <w:r>
-        <w:t xml:space="preserve">This example shows how to use the PyTorch-backed MLP classifier exposed by</w:t>
+        <w:t xml:space="preserve">This example uses the PyTorch-backed MLP classifier exposed by</w:t>
       </w:r>
       <w:r>
         <w:t xml:space="preserve"> </w:t>
@@ -28,22 +28,10 @@
         <w:t xml:space="preserve">daltoolboxdp</w:t>
       </w:r>
       <w:r>
-        <w:t xml:space="preserve">. The workflow stays close to the</w:t>
-      </w:r>
-      <w:r>
-        <w:t xml:space="preserve"> </w:t>
-      </w:r>
-      <w:r>
-        <w:rPr>
-          <w:rStyle w:val="VerbatimChar"/>
-        </w:rPr>
-        <w:t xml:space="preserve">daltoolbox</w:t>
-      </w:r>
-      <w:r>
-        <w:t xml:space="preserve"> </w:t>
-      </w:r>
-      <w:r>
-        <w:t xml:space="preserve">classification line: prepare data, split into train/test, fit the model, inspect predictions, and optionally inspect class probabilities.</w:t>
+        <w:t xml:space="preserve"> </w:t>
+      </w:r>
+      <w:r>
+        <w:t xml:space="preserve">to classify the Iris dataset. The workflow mirrors the scikit-learn MLP example: split train/test, train, predict, and evaluate.</w:t>
       </w:r>
     </w:p>
     <w:p>
@@ -102,21 +90,6 @@
         </w:rPr>
         <w:t xml:space="preserve">(daltoolbox)</w:t>
       </w:r>
-      <w:r>
-        <w:br/>
-      </w:r>
-      <w:r>
-        <w:rPr>
-          <w:rStyle w:val="FunctionTok"/>
-        </w:rPr>
-        <w:t xml:space="preserve">library</w:t>
-      </w:r>
-      <w:r>
-        <w:rPr>
-          <w:rStyle w:val="NormalTok"/>
-        </w:rPr>
-        <w:t xml:space="preserve">(daltoolboxdp)</w:t>
-      </w:r>
     </w:p>
     <w:p>
       <w:pPr>
@@ -124,330 +97,9 @@
       </w:pPr>
       <w:r>
         <w:rPr>
-          <w:rStyle w:val="CommentTok"/>
-        </w:rPr>
-        <w:t xml:space="preserve"># Prepare Iris with a numeric target for the current wrapper</w:t>
-      </w:r>
-      <w:r>
-        <w:br/>
-      </w:r>
-      <w:r>
-        <w:rPr>
-          <w:rStyle w:val="NormalTok"/>
-        </w:rPr>
-        <w:t xml:space="preserve">iris_torch </w:t>
-      </w:r>
-      <w:r>
-        <w:rPr>
-          <w:rStyle w:val="OtherTok"/>
-        </w:rPr>
-        <w:t xml:space="preserve">&lt;-</w:t>
-      </w:r>
-      <w:r>
-        <w:rPr>
-          <w:rStyle w:val="NormalTok"/>
-        </w:rPr>
-        <w:t xml:space="preserve"> </w:t>
-      </w:r>
-      <w:r>
-        <w:rPr>
-          <w:rStyle w:val="FunctionTok"/>
-        </w:rPr>
-        <w:t xml:space="preserve">data.frame</w:t>
-      </w:r>
-      <w:r>
-        <w:rPr>
-          <w:rStyle w:val="NormalTok"/>
-        </w:rPr>
-        <w:t xml:space="preserve">(</w:t>
-      </w:r>
-      <w:r>
-        <w:br/>
-      </w:r>
-      <w:r>
-        <w:rPr>
-          <w:rStyle w:val="NormalTok"/>
-        </w:rPr>
-        <w:t xml:space="preserve">  iris[, </w:t>
-      </w:r>
-      <w:r>
-        <w:rPr>
-          <w:rStyle w:val="DecValTok"/>
-        </w:rPr>
-        <w:t xml:space="preserve">1</w:t>
-      </w:r>
-      <w:r>
-        <w:rPr>
-          <w:rStyle w:val="SpecialCharTok"/>
-        </w:rPr>
-        <w:t xml:space="preserve">:</w:t>
-      </w:r>
-      <w:r>
-        <w:rPr>
-          <w:rStyle w:val="DecValTok"/>
-        </w:rPr>
-        <w:t xml:space="preserve">4</w:t>
-      </w:r>
-      <w:r>
-        <w:rPr>
-          <w:rStyle w:val="NormalTok"/>
-        </w:rPr>
-        <w:t xml:space="preserve">],</w:t>
-      </w:r>
-      <w:r>
-        <w:br/>
-      </w:r>
-      <w:r>
-        <w:rPr>
-          <w:rStyle w:val="NormalTok"/>
-        </w:rPr>
-        <w:t xml:space="preserve">  </w:t>
-      </w:r>
-      <w:r>
-        <w:rPr>
-          <w:rStyle w:val="AttributeTok"/>
-        </w:rPr>
-        <w:t xml:space="preserve">species_encoded =</w:t>
-      </w:r>
-      <w:r>
-        <w:rPr>
-          <w:rStyle w:val="NormalTok"/>
-        </w:rPr>
-        <w:t xml:space="preserve"> </w:t>
-      </w:r>
-      <w:r>
-        <w:rPr>
-          <w:rStyle w:val="FunctionTok"/>
-        </w:rPr>
-        <w:t xml:space="preserve">as.integer</w:t>
-      </w:r>
-      <w:r>
-        <w:rPr>
-          <w:rStyle w:val="NormalTok"/>
-        </w:rPr>
-        <w:t xml:space="preserve">(iris</w:t>
-      </w:r>
-      <w:r>
-        <w:rPr>
-          <w:rStyle w:val="SpecialCharTok"/>
-        </w:rPr>
-        <w:t xml:space="preserve">$</w:t>
-      </w:r>
-      <w:r>
-        <w:rPr>
-          <w:rStyle w:val="NormalTok"/>
-        </w:rPr>
-        <w:t xml:space="preserve">Species)</w:t>
-      </w:r>
-      <w:r>
-        <w:br/>
-      </w:r>
-      <w:r>
-        <w:rPr>
-          <w:rStyle w:val="NormalTok"/>
-        </w:rPr>
-        <w:t xml:space="preserve">)</w:t>
-      </w:r>
-      <w:r>
-        <w:br/>
-      </w:r>
-      <w:r>
-        <w:br/>
-      </w:r>
-      <w:r>
-        <w:rPr>
-          <w:rStyle w:val="FunctionTok"/>
-        </w:rPr>
-        <w:t xml:space="preserve">set.seed</w:t>
-      </w:r>
-      <w:r>
-        <w:rPr>
-          <w:rStyle w:val="NormalTok"/>
-        </w:rPr>
-        <w:t xml:space="preserve">(</w:t>
-      </w:r>
-      <w:r>
-        <w:rPr>
-          <w:rStyle w:val="DecValTok"/>
-        </w:rPr>
-        <w:t xml:space="preserve">1</w:t>
-      </w:r>
-      <w:r>
-        <w:rPr>
-          <w:rStyle w:val="NormalTok"/>
-        </w:rPr>
-        <w:t xml:space="preserve">)</w:t>
-      </w:r>
-      <w:r>
-        <w:br/>
-      </w:r>
-      <w:r>
-        <w:rPr>
-          <w:rStyle w:val="NormalTok"/>
-        </w:rPr>
-        <w:t xml:space="preserve">idx </w:t>
-      </w:r>
-      <w:r>
-        <w:rPr>
-          <w:rStyle w:val="OtherTok"/>
-        </w:rPr>
-        <w:t xml:space="preserve">&lt;-</w:t>
-      </w:r>
-      <w:r>
-        <w:rPr>
-          <w:rStyle w:val="NormalTok"/>
-        </w:rPr>
-        <w:t xml:space="preserve"> </w:t>
-      </w:r>
-      <w:r>
-        <w:rPr>
-          <w:rStyle w:val="FunctionTok"/>
-        </w:rPr>
-        <w:t xml:space="preserve">sample</w:t>
-      </w:r>
-      <w:r>
-        <w:rPr>
-          <w:rStyle w:val="NormalTok"/>
-        </w:rPr>
-        <w:t xml:space="preserve">(</w:t>
-      </w:r>
-      <w:r>
-        <w:rPr>
-          <w:rStyle w:val="FunctionTok"/>
-        </w:rPr>
-        <w:t xml:space="preserve">seq_len</w:t>
-      </w:r>
-      <w:r>
-        <w:rPr>
-          <w:rStyle w:val="NormalTok"/>
-        </w:rPr>
-        <w:t xml:space="preserve">(</w:t>
-      </w:r>
-      <w:r>
-        <w:rPr>
-          <w:rStyle w:val="FunctionTok"/>
-        </w:rPr>
-        <w:t xml:space="preserve">nrow</w:t>
-      </w:r>
-      <w:r>
-        <w:rPr>
-          <w:rStyle w:val="NormalTok"/>
-        </w:rPr>
-        <w:t xml:space="preserve">(iris_torch)), </w:t>
-      </w:r>
-      <w:r>
-        <w:rPr>
-          <w:rStyle w:val="AttributeTok"/>
-        </w:rPr>
-        <w:t xml:space="preserve">size =</w:t>
-      </w:r>
-      <w:r>
-        <w:rPr>
-          <w:rStyle w:val="NormalTok"/>
-        </w:rPr>
-        <w:t xml:space="preserve"> </w:t>
-      </w:r>
-      <w:r>
-        <w:rPr>
-          <w:rStyle w:val="FunctionTok"/>
-        </w:rPr>
-        <w:t xml:space="preserve">floor</w:t>
-      </w:r>
-      <w:r>
-        <w:rPr>
-          <w:rStyle w:val="NormalTok"/>
-        </w:rPr>
-        <w:t xml:space="preserve">(</w:t>
-      </w:r>
-      <w:r>
-        <w:rPr>
-          <w:rStyle w:val="FloatTok"/>
-        </w:rPr>
-        <w:t xml:space="preserve">0.8</w:t>
-      </w:r>
-      <w:r>
-        <w:rPr>
-          <w:rStyle w:val="NormalTok"/>
-        </w:rPr>
-        <w:t xml:space="preserve"> </w:t>
-      </w:r>
-      <w:r>
-        <w:rPr>
-          <w:rStyle w:val="SpecialCharTok"/>
-        </w:rPr>
-        <w:t xml:space="preserve">*</w:t>
-      </w:r>
-      <w:r>
-        <w:rPr>
-          <w:rStyle w:val="NormalTok"/>
-        </w:rPr>
-        <w:t xml:space="preserve"> </w:t>
-      </w:r>
-      <w:r>
-        <w:rPr>
-          <w:rStyle w:val="FunctionTok"/>
-        </w:rPr>
-        <w:t xml:space="preserve">nrow</w:t>
-      </w:r>
-      <w:r>
-        <w:rPr>
-          <w:rStyle w:val="NormalTok"/>
-        </w:rPr>
-        <w:t xml:space="preserve">(iris_torch)))</w:t>
-      </w:r>
-      <w:r>
-        <w:br/>
-      </w:r>
-      <w:r>
-        <w:rPr>
-          <w:rStyle w:val="NormalTok"/>
-        </w:rPr>
-        <w:t xml:space="preserve">iris_train </w:t>
-      </w:r>
-      <w:r>
-        <w:rPr>
-          <w:rStyle w:val="OtherTok"/>
-        </w:rPr>
-        <w:t xml:space="preserve">&lt;-</w:t>
-      </w:r>
-      <w:r>
-        <w:rPr>
-          <w:rStyle w:val="NormalTok"/>
-        </w:rPr>
-        <w:t xml:space="preserve"> iris_torch[idx, ]</w:t>
-      </w:r>
-      <w:r>
-        <w:br/>
-      </w:r>
-      <w:r>
-        <w:rPr>
-          <w:rStyle w:val="NormalTok"/>
-        </w:rPr>
-        <w:t xml:space="preserve">iris_test </w:t>
-      </w:r>
-      <w:r>
-        <w:rPr>
-          <w:rStyle w:val="OtherTok"/>
-        </w:rPr>
-        <w:t xml:space="preserve">&lt;-</w:t>
-      </w:r>
-      <w:r>
-        <w:rPr>
-          <w:rStyle w:val="NormalTok"/>
-        </w:rPr>
-        <w:t xml:space="preserve"> iris_torch[</w:t>
-      </w:r>
-      <w:r>
-        <w:rPr>
-          <w:rStyle w:val="SpecialCharTok"/>
-        </w:rPr>
-        <w:t xml:space="preserve">-</w:t>
-      </w:r>
-      <w:r>
-        <w:rPr>
-          <w:rStyle w:val="NormalTok"/>
-        </w:rPr>
-        <w:t xml:space="preserve">idx, ]</w:t>
+          <w:rStyle w:val="VerbatimChar"/>
+        </w:rPr>
+        <w:t xml:space="preserve">## Warning: package 'daltoolbox' was built under R version 4.5.3</w:t>
       </w:r>
     </w:p>
     <w:p>
@@ -456,387 +108,18 @@
       </w:pPr>
       <w:r>
         <w:rPr>
-          <w:rStyle w:val="CommentTok"/>
-        </w:rPr>
-        <w:t xml:space="preserve"># Fit the classifier</w:t>
-      </w:r>
-      <w:r>
-        <w:br/>
-      </w:r>
-      <w:r>
-        <w:rPr>
-          <w:rStyle w:val="NormalTok"/>
-        </w:rPr>
-        <w:t xml:space="preserve">model </w:t>
-      </w:r>
-      <w:r>
-        <w:rPr>
-          <w:rStyle w:val="OtherTok"/>
-        </w:rPr>
-        <w:t xml:space="preserve">&lt;-</w:t>
-      </w:r>
-      <w:r>
-        <w:rPr>
-          <w:rStyle w:val="NormalTok"/>
-        </w:rPr>
-        <w:t xml:space="preserve"> </w:t>
-      </w:r>
-      <w:r>
-        <w:rPr>
-          <w:rStyle w:val="FunctionTok"/>
-        </w:rPr>
-        <w:t xml:space="preserve">torch_cla_mlp</w:t>
-      </w:r>
-      <w:r>
-        <w:rPr>
-          <w:rStyle w:val="NormalTok"/>
-        </w:rPr>
-        <w:t xml:space="preserve">(</w:t>
-      </w:r>
-      <w:r>
-        <w:br/>
-      </w:r>
-      <w:r>
-        <w:rPr>
-          <w:rStyle w:val="NormalTok"/>
-        </w:rPr>
-        <w:t xml:space="preserve">  </w:t>
-      </w:r>
-      <w:r>
-        <w:rPr>
-          <w:rStyle w:val="AttributeTok"/>
-        </w:rPr>
-        <w:t xml:space="preserve">attribute =</w:t>
-      </w:r>
-      <w:r>
-        <w:rPr>
-          <w:rStyle w:val="NormalTok"/>
-        </w:rPr>
-        <w:t xml:space="preserve"> </w:t>
-      </w:r>
-      <w:r>
-        <w:rPr>
-          <w:rStyle w:val="StringTok"/>
-        </w:rPr>
-        <w:t xml:space="preserve">"species_encoded"</w:t>
-      </w:r>
-      <w:r>
-        <w:rPr>
-          <w:rStyle w:val="NormalTok"/>
-        </w:rPr>
-        <w:t xml:space="preserve">,</w:t>
-      </w:r>
-      <w:r>
-        <w:br/>
-      </w:r>
-      <w:r>
-        <w:rPr>
-          <w:rStyle w:val="NormalTok"/>
-        </w:rPr>
-        <w:t xml:space="preserve">  </w:t>
-      </w:r>
-      <w:r>
-        <w:rPr>
-          <w:rStyle w:val="AttributeTok"/>
-        </w:rPr>
-        <w:t xml:space="preserve">slevels =</w:t>
-      </w:r>
-      <w:r>
-        <w:rPr>
-          <w:rStyle w:val="NormalTok"/>
-        </w:rPr>
-        <w:t xml:space="preserve"> </w:t>
-      </w:r>
-      <w:r>
-        <w:rPr>
-          <w:rStyle w:val="FunctionTok"/>
-        </w:rPr>
-        <w:t xml:space="preserve">c</w:t>
-      </w:r>
-      <w:r>
-        <w:rPr>
-          <w:rStyle w:val="NormalTok"/>
-        </w:rPr>
-        <w:t xml:space="preserve">(</w:t>
-      </w:r>
-      <w:r>
-        <w:rPr>
-          <w:rStyle w:val="DecValTok"/>
-        </w:rPr>
-        <w:t xml:space="preserve">1</w:t>
-      </w:r>
-      <w:r>
-        <w:rPr>
-          <w:rStyle w:val="DataTypeTok"/>
-        </w:rPr>
-        <w:t xml:space="preserve">L</w:t>
-      </w:r>
-      <w:r>
-        <w:rPr>
-          <w:rStyle w:val="NormalTok"/>
-        </w:rPr>
-        <w:t xml:space="preserve">, </w:t>
-      </w:r>
-      <w:r>
-        <w:rPr>
-          <w:rStyle w:val="DecValTok"/>
-        </w:rPr>
-        <w:t xml:space="preserve">2</w:t>
-      </w:r>
-      <w:r>
-        <w:rPr>
-          <w:rStyle w:val="DataTypeTok"/>
-        </w:rPr>
-        <w:t xml:space="preserve">L</w:t>
-      </w:r>
-      <w:r>
-        <w:rPr>
-          <w:rStyle w:val="NormalTok"/>
-        </w:rPr>
-        <w:t xml:space="preserve">, </w:t>
-      </w:r>
-      <w:r>
-        <w:rPr>
-          <w:rStyle w:val="DecValTok"/>
-        </w:rPr>
-        <w:t xml:space="preserve">3</w:t>
-      </w:r>
-      <w:r>
-        <w:rPr>
-          <w:rStyle w:val="DataTypeTok"/>
-        </w:rPr>
-        <w:t xml:space="preserve">L</w:t>
-      </w:r>
-      <w:r>
-        <w:rPr>
-          <w:rStyle w:val="NormalTok"/>
-        </w:rPr>
-        <w:t xml:space="preserve">),</w:t>
-      </w:r>
-      <w:r>
-        <w:br/>
-      </w:r>
-      <w:r>
-        <w:rPr>
-          <w:rStyle w:val="NormalTok"/>
-        </w:rPr>
-        <w:t xml:space="preserve">  </w:t>
-      </w:r>
-      <w:r>
-        <w:rPr>
-          <w:rStyle w:val="AttributeTok"/>
-        </w:rPr>
-        <w:t xml:space="preserve">input_size =</w:t>
-      </w:r>
-      <w:r>
-        <w:rPr>
-          <w:rStyle w:val="NormalTok"/>
-        </w:rPr>
-        <w:t xml:space="preserve"> </w:t>
-      </w:r>
-      <w:r>
-        <w:rPr>
-          <w:rStyle w:val="DecValTok"/>
-        </w:rPr>
-        <w:t xml:space="preserve">4</w:t>
-      </w:r>
-      <w:r>
-        <w:rPr>
-          <w:rStyle w:val="DataTypeTok"/>
-        </w:rPr>
-        <w:t xml:space="preserve">L</w:t>
-      </w:r>
-      <w:r>
-        <w:rPr>
-          <w:rStyle w:val="NormalTok"/>
-        </w:rPr>
-        <w:t xml:space="preserve">,</w:t>
-      </w:r>
-      <w:r>
-        <w:br/>
-      </w:r>
-      <w:r>
-        <w:rPr>
-          <w:rStyle w:val="NormalTok"/>
-        </w:rPr>
-        <w:t xml:space="preserve">  </w:t>
-      </w:r>
-      <w:r>
-        <w:rPr>
-          <w:rStyle w:val="AttributeTok"/>
-        </w:rPr>
-        <w:t xml:space="preserve">hidden_sizes =</w:t>
-      </w:r>
-      <w:r>
-        <w:rPr>
-          <w:rStyle w:val="NormalTok"/>
-        </w:rPr>
-        <w:t xml:space="preserve"> </w:t>
-      </w:r>
-      <w:r>
-        <w:rPr>
-          <w:rStyle w:val="FunctionTok"/>
-        </w:rPr>
-        <w:t xml:space="preserve">c</w:t>
-      </w:r>
-      <w:r>
-        <w:rPr>
-          <w:rStyle w:val="NormalTok"/>
-        </w:rPr>
-        <w:t xml:space="preserve">(</w:t>
-      </w:r>
-      <w:r>
-        <w:rPr>
-          <w:rStyle w:val="DecValTok"/>
-        </w:rPr>
-        <w:t xml:space="preserve">16</w:t>
-      </w:r>
-      <w:r>
-        <w:rPr>
-          <w:rStyle w:val="DataTypeTok"/>
-        </w:rPr>
-        <w:t xml:space="preserve">L</w:t>
-      </w:r>
-      <w:r>
-        <w:rPr>
-          <w:rStyle w:val="NormalTok"/>
-        </w:rPr>
-        <w:t xml:space="preserve">, </w:t>
-      </w:r>
-      <w:r>
-        <w:rPr>
-          <w:rStyle w:val="DecValTok"/>
-        </w:rPr>
-        <w:t xml:space="preserve">8</w:t>
-      </w:r>
-      <w:r>
-        <w:rPr>
-          <w:rStyle w:val="DataTypeTok"/>
-        </w:rPr>
-        <w:t xml:space="preserve">L</w:t>
-      </w:r>
-      <w:r>
-        <w:rPr>
-          <w:rStyle w:val="NormalTok"/>
-        </w:rPr>
-        <w:t xml:space="preserve">),</w:t>
-      </w:r>
-      <w:r>
-        <w:br/>
-      </w:r>
-      <w:r>
-        <w:rPr>
-          <w:rStyle w:val="NormalTok"/>
-        </w:rPr>
-        <w:t xml:space="preserve">  </w:t>
-      </w:r>
-      <w:r>
-        <w:rPr>
-          <w:rStyle w:val="AttributeTok"/>
-        </w:rPr>
-        <w:t xml:space="preserve">num_classes =</w:t>
-      </w:r>
-      <w:r>
-        <w:rPr>
-          <w:rStyle w:val="NormalTok"/>
-        </w:rPr>
-        <w:t xml:space="preserve"> </w:t>
-      </w:r>
-      <w:r>
-        <w:rPr>
-          <w:rStyle w:val="DecValTok"/>
-        </w:rPr>
-        <w:t xml:space="preserve">3</w:t>
-      </w:r>
-      <w:r>
-        <w:rPr>
-          <w:rStyle w:val="DataTypeTok"/>
-        </w:rPr>
-        <w:t xml:space="preserve">L</w:t>
-      </w:r>
-      <w:r>
-        <w:rPr>
-          <w:rStyle w:val="NormalTok"/>
-        </w:rPr>
-        <w:t xml:space="preserve">,</w:t>
-      </w:r>
-      <w:r>
-        <w:br/>
-      </w:r>
-      <w:r>
-        <w:rPr>
-          <w:rStyle w:val="NormalTok"/>
-        </w:rPr>
-        <w:t xml:space="preserve">  </w:t>
-      </w:r>
-      <w:r>
-        <w:rPr>
-          <w:rStyle w:val="AttributeTok"/>
-        </w:rPr>
-        <w:t xml:space="preserve">epochs =</w:t>
-      </w:r>
-      <w:r>
-        <w:rPr>
-          <w:rStyle w:val="NormalTok"/>
-        </w:rPr>
-        <w:t xml:space="preserve"> </w:t>
-      </w:r>
-      <w:r>
-        <w:rPr>
-          <w:rStyle w:val="DecValTok"/>
-        </w:rPr>
-        <w:t xml:space="preserve">100</w:t>
-      </w:r>
-      <w:r>
-        <w:rPr>
-          <w:rStyle w:val="DataTypeTok"/>
-        </w:rPr>
-        <w:t xml:space="preserve">L</w:t>
-      </w:r>
-      <w:r>
-        <w:br/>
-      </w:r>
-      <w:r>
-        <w:rPr>
-          <w:rStyle w:val="NormalTok"/>
-        </w:rPr>
-        <w:t xml:space="preserve">)</w:t>
-      </w:r>
-      <w:r>
-        <w:br/>
-      </w:r>
-      <w:r>
-        <w:br/>
-      </w:r>
-      <w:r>
-        <w:rPr>
-          <w:rStyle w:val="NormalTok"/>
-        </w:rPr>
-        <w:t xml:space="preserve">model </w:t>
-      </w:r>
-      <w:r>
-        <w:rPr>
-          <w:rStyle w:val="OtherTok"/>
-        </w:rPr>
-        <w:t xml:space="preserve">&lt;-</w:t>
-      </w:r>
-      <w:r>
-        <w:rPr>
-          <w:rStyle w:val="NormalTok"/>
-        </w:rPr>
-        <w:t xml:space="preserve"> </w:t>
-      </w:r>
-      <w:r>
-        <w:rPr>
-          <w:rStyle w:val="FunctionTok"/>
-        </w:rPr>
-        <w:t xml:space="preserve">fit</w:t>
-      </w:r>
-      <w:r>
-        <w:rPr>
-          <w:rStyle w:val="NormalTok"/>
-        </w:rPr>
-        <w:t xml:space="preserve">(model, iris_train)</w:t>
+          <w:rStyle w:val="VerbatimChar"/>
+        </w:rPr>
+        <w:t xml:space="preserve">## </w:t>
+      </w:r>
+      <w:r>
+        <w:br/>
+      </w:r>
+      <w:r>
+        <w:rPr>
+          <w:rStyle w:val="VerbatimChar"/>
+        </w:rPr>
+        <w:t xml:space="preserve">## Attaching package: 'daltoolbox'</w:t>
       </w:r>
     </w:p>
     <w:p>
@@ -845,57 +128,27 @@
       </w:pPr>
       <w:r>
         <w:rPr>
-          <w:rStyle w:val="CommentTok"/>
-        </w:rPr>
-        <w:t xml:space="preserve"># Predicted classes</w:t>
-      </w:r>
-      <w:r>
-        <w:br/>
-      </w:r>
-      <w:r>
-        <w:rPr>
-          <w:rStyle w:val="NormalTok"/>
-        </w:rPr>
-        <w:t xml:space="preserve">prediction </w:t>
-      </w:r>
-      <w:r>
-        <w:rPr>
-          <w:rStyle w:val="OtherTok"/>
-        </w:rPr>
-        <w:t xml:space="preserve">&lt;-</w:t>
-      </w:r>
-      <w:r>
-        <w:rPr>
-          <w:rStyle w:val="NormalTok"/>
-        </w:rPr>
-        <w:t xml:space="preserve"> </w:t>
-      </w:r>
-      <w:r>
-        <w:rPr>
-          <w:rStyle w:val="FunctionTok"/>
-        </w:rPr>
-        <w:t xml:space="preserve">predict</w:t>
-      </w:r>
-      <w:r>
-        <w:rPr>
-          <w:rStyle w:val="NormalTok"/>
-        </w:rPr>
-        <w:t xml:space="preserve">(model, iris_test)</w:t>
-      </w:r>
-      <w:r>
-        <w:br/>
-      </w:r>
-      <w:r>
-        <w:rPr>
-          <w:rStyle w:val="FunctionTok"/>
-        </w:rPr>
-        <w:t xml:space="preserve">head</w:t>
-      </w:r>
-      <w:r>
-        <w:rPr>
-          <w:rStyle w:val="NormalTok"/>
-        </w:rPr>
-        <w:t xml:space="preserve">(prediction)</w:t>
+          <w:rStyle w:val="VerbatimChar"/>
+        </w:rPr>
+        <w:t xml:space="preserve">## The following object is masked from 'package:base':</w:t>
+      </w:r>
+      <w:r>
+        <w:br/>
+      </w:r>
+      <w:r>
+        <w:rPr>
+          <w:rStyle w:val="VerbatimChar"/>
+        </w:rPr>
+        <w:t xml:space="preserve">## </w:t>
+      </w:r>
+      <w:r>
+        <w:br/>
+      </w:r>
+      <w:r>
+        <w:rPr>
+          <w:rStyle w:val="VerbatimChar"/>
+        </w:rPr>
+        <w:t xml:space="preserve">##     transform</w:t>
       </w:r>
     </w:p>
     <w:p>
@@ -904,63 +157,15 @@
       </w:pPr>
       <w:r>
         <w:rPr>
-          <w:rStyle w:val="VerbatimChar"/>
-        </w:rPr>
-        <w:t xml:space="preserve">##      1 2 3</w:t>
-      </w:r>
-      <w:r>
-        <w:br/>
-      </w:r>
-      <w:r>
-        <w:rPr>
-          <w:rStyle w:val="VerbatimChar"/>
-        </w:rPr>
-        <w:t xml:space="preserve">## [1,] 1 0 0</w:t>
-      </w:r>
-      <w:r>
-        <w:br/>
-      </w:r>
-      <w:r>
-        <w:rPr>
-          <w:rStyle w:val="VerbatimChar"/>
-        </w:rPr>
-        <w:t xml:space="preserve">## [2,] 1 0 0</w:t>
-      </w:r>
-      <w:r>
-        <w:br/>
-      </w:r>
-      <w:r>
-        <w:rPr>
-          <w:rStyle w:val="VerbatimChar"/>
-        </w:rPr>
-        <w:t xml:space="preserve">## [3,] 1 0 0</w:t>
-      </w:r>
-      <w:r>
-        <w:br/>
-      </w:r>
-      <w:r>
-        <w:rPr>
-          <w:rStyle w:val="VerbatimChar"/>
-        </w:rPr>
-        <w:t xml:space="preserve">## [4,] 1 0 0</w:t>
-      </w:r>
-      <w:r>
-        <w:br/>
-      </w:r>
-      <w:r>
-        <w:rPr>
-          <w:rStyle w:val="VerbatimChar"/>
-        </w:rPr>
-        <w:t xml:space="preserve">## [5,] 1 0 0</w:t>
-      </w:r>
-      <w:r>
-        <w:br/>
-      </w:r>
-      <w:r>
-        <w:rPr>
-          <w:rStyle w:val="VerbatimChar"/>
-        </w:rPr>
-        <w:t xml:space="preserve">## [6,] 1 0 0</w:t>
+          <w:rStyle w:val="FunctionTok"/>
+        </w:rPr>
+        <w:t xml:space="preserve">library</w:t>
+      </w:r>
+      <w:r>
+        <w:rPr>
+          <w:rStyle w:val="NormalTok"/>
+        </w:rPr>
+        <w:t xml:space="preserve">(daltoolboxdp)</w:t>
       </w:r>
     </w:p>
     <w:p>
@@ -971,16 +176,16 @@
         <w:rPr>
           <w:rStyle w:val="CommentTok"/>
         </w:rPr>
-        <w:t xml:space="preserve"># Predicted probabilities</w:t>
-      </w:r>
-      <w:r>
-        <w:br/>
-      </w:r>
-      <w:r>
-        <w:rPr>
-          <w:rStyle w:val="NormalTok"/>
-        </w:rPr>
-        <w:t xml:space="preserve">probabilities </w:t>
+        <w:t xml:space="preserve"># Loading Iris dataset</w:t>
+      </w:r>
+      <w:r>
+        <w:br/>
+      </w:r>
+      <w:r>
+        <w:rPr>
+          <w:rStyle w:val="NormalTok"/>
+        </w:rPr>
+        <w:t xml:space="preserve">iris </w:t>
       </w:r>
       <w:r>
         <w:rPr>
@@ -992,82 +197,19 @@
         <w:rPr>
           <w:rStyle w:val="NormalTok"/>
         </w:rPr>
-        <w:t xml:space="preserve"> </w:t>
-      </w:r>
-      <w:r>
-        <w:rPr>
-          <w:rStyle w:val="FunctionTok"/>
-        </w:rPr>
-        <w:t xml:space="preserve">predict_proba.torch_cla_mlp</w:t>
-      </w:r>
-      <w:r>
-        <w:rPr>
-          <w:rStyle w:val="NormalTok"/>
-        </w:rPr>
-        <w:t xml:space="preserve">(model, iris_test[, </w:t>
-      </w:r>
-      <w:r>
-        <w:rPr>
-          <w:rStyle w:val="DecValTok"/>
-        </w:rPr>
-        <w:t xml:space="preserve">1</w:t>
+        <w:t xml:space="preserve"> datasets</w:t>
       </w:r>
       <w:r>
         <w:rPr>
           <w:rStyle w:val="SpecialCharTok"/>
         </w:rPr>
-        <w:t xml:space="preserve">:</w:t>
-      </w:r>
-      <w:r>
-        <w:rPr>
-          <w:rStyle w:val="DecValTok"/>
-        </w:rPr>
-        <w:t xml:space="preserve">4</w:t>
-      </w:r>
-      <w:r>
-        <w:rPr>
-          <w:rStyle w:val="NormalTok"/>
-        </w:rPr>
-        <w:t xml:space="preserve">])</w:t>
-      </w:r>
-      <w:r>
-        <w:br/>
-      </w:r>
-      <w:r>
-        <w:rPr>
-          <w:rStyle w:val="FunctionTok"/>
-        </w:rPr>
-        <w:t xml:space="preserve">str</w:t>
-      </w:r>
-      <w:r>
-        <w:rPr>
-          <w:rStyle w:val="NormalTok"/>
-        </w:rPr>
-        <w:t xml:space="preserve">(probabilities[</w:t>
-      </w:r>
-      <w:r>
-        <w:rPr>
-          <w:rStyle w:val="DecValTok"/>
-        </w:rPr>
-        <w:t xml:space="preserve">1</w:t>
-      </w:r>
-      <w:r>
-        <w:rPr>
-          <w:rStyle w:val="SpecialCharTok"/>
-        </w:rPr>
-        <w:t xml:space="preserve">:</w:t>
-      </w:r>
-      <w:r>
-        <w:rPr>
-          <w:rStyle w:val="DecValTok"/>
-        </w:rPr>
-        <w:t xml:space="preserve">3</w:t>
-      </w:r>
-      <w:r>
-        <w:rPr>
-          <w:rStyle w:val="NormalTok"/>
-        </w:rPr>
-        <w:t xml:space="preserve">])</w:t>
+        <w:t xml:space="preserve">::</w:t>
+      </w:r>
+      <w:r>
+        <w:rPr>
+          <w:rStyle w:val="NormalTok"/>
+        </w:rPr>
+        <w:t xml:space="preserve">iris</w:t>
       </w:r>
     </w:p>
     <w:p>
@@ -1076,36 +218,1102 @@
       </w:pPr>
       <w:r>
         <w:rPr>
-          <w:rStyle w:val="VerbatimChar"/>
-        </w:rPr>
-        <w:t xml:space="preserve">## List of 3</w:t>
-      </w:r>
-      <w:r>
-        <w:br/>
-      </w:r>
-      <w:r>
-        <w:rPr>
-          <w:rStyle w:val="VerbatimChar"/>
-        </w:rPr>
-        <w:t xml:space="preserve">##  $ : num [1:3] 0.90684 0.08488 0.00828</w:t>
-      </w:r>
-      <w:r>
-        <w:br/>
-      </w:r>
-      <w:r>
-        <w:rPr>
-          <w:rStyle w:val="VerbatimChar"/>
-        </w:rPr>
-        <w:t xml:space="preserve">##  $ : num [1:3] 0.94277 0.05336 0.00387</w:t>
-      </w:r>
-      <w:r>
-        <w:br/>
-      </w:r>
-      <w:r>
-        <w:rPr>
-          <w:rStyle w:val="VerbatimChar"/>
-        </w:rPr>
-        <w:t xml:space="preserve">##  $ : num [1:3] 0.93306 0.06212 0.00482</w:t>
+          <w:rStyle w:val="CommentTok"/>
+        </w:rPr>
+        <w:t xml:space="preserve"># Training and evaluation with PyTorch MLP</w:t>
+      </w:r>
+      <w:r>
+        <w:br/>
+      </w:r>
+      <w:r>
+        <w:rPr>
+          <w:rStyle w:val="NormalTok"/>
+        </w:rPr>
+        <w:t xml:space="preserve">slevels </w:t>
+      </w:r>
+      <w:r>
+        <w:rPr>
+          <w:rStyle w:val="OtherTok"/>
+        </w:rPr>
+        <w:t xml:space="preserve">&lt;-</w:t>
+      </w:r>
+      <w:r>
+        <w:rPr>
+          <w:rStyle w:val="NormalTok"/>
+        </w:rPr>
+        <w:t xml:space="preserve"> </w:t>
+      </w:r>
+      <w:r>
+        <w:rPr>
+          <w:rStyle w:val="FunctionTok"/>
+        </w:rPr>
+        <w:t xml:space="preserve">levels</w:t>
+      </w:r>
+      <w:r>
+        <w:rPr>
+          <w:rStyle w:val="NormalTok"/>
+        </w:rPr>
+        <w:t xml:space="preserve">(iris</w:t>
+      </w:r>
+      <w:r>
+        <w:rPr>
+          <w:rStyle w:val="SpecialCharTok"/>
+        </w:rPr>
+        <w:t xml:space="preserve">$</w:t>
+      </w:r>
+      <w:r>
+        <w:rPr>
+          <w:rStyle w:val="NormalTok"/>
+        </w:rPr>
+        <w:t xml:space="preserve">Species)</w:t>
+      </w:r>
+      <w:r>
+        <w:br/>
+      </w:r>
+      <w:r>
+        <w:br/>
+      </w:r>
+      <w:r>
+        <w:rPr>
+          <w:rStyle w:val="FunctionTok"/>
+        </w:rPr>
+        <w:t xml:space="preserve">set.seed</w:t>
+      </w:r>
+      <w:r>
+        <w:rPr>
+          <w:rStyle w:val="NormalTok"/>
+        </w:rPr>
+        <w:t xml:space="preserve">(</w:t>
+      </w:r>
+      <w:r>
+        <w:rPr>
+          <w:rStyle w:val="DecValTok"/>
+        </w:rPr>
+        <w:t xml:space="preserve">1</w:t>
+      </w:r>
+      <w:r>
+        <w:rPr>
+          <w:rStyle w:val="NormalTok"/>
+        </w:rPr>
+        <w:t xml:space="preserve">)</w:t>
+      </w:r>
+      <w:r>
+        <w:br/>
+      </w:r>
+      <w:r>
+        <w:rPr>
+          <w:rStyle w:val="NormalTok"/>
+        </w:rPr>
+        <w:t xml:space="preserve">sr </w:t>
+      </w:r>
+      <w:r>
+        <w:rPr>
+          <w:rStyle w:val="OtherTok"/>
+        </w:rPr>
+        <w:t xml:space="preserve">&lt;-</w:t>
+      </w:r>
+      <w:r>
+        <w:rPr>
+          <w:rStyle w:val="NormalTok"/>
+        </w:rPr>
+        <w:t xml:space="preserve"> </w:t>
+      </w:r>
+      <w:r>
+        <w:rPr>
+          <w:rStyle w:val="FunctionTok"/>
+        </w:rPr>
+        <w:t xml:space="preserve">sample_random</w:t>
+      </w:r>
+      <w:r>
+        <w:rPr>
+          <w:rStyle w:val="NormalTok"/>
+        </w:rPr>
+        <w:t xml:space="preserve">()</w:t>
+      </w:r>
+      <w:r>
+        <w:br/>
+      </w:r>
+      <w:r>
+        <w:rPr>
+          <w:rStyle w:val="NormalTok"/>
+        </w:rPr>
+        <w:t xml:space="preserve">sr </w:t>
+      </w:r>
+      <w:r>
+        <w:rPr>
+          <w:rStyle w:val="OtherTok"/>
+        </w:rPr>
+        <w:t xml:space="preserve">&lt;-</w:t>
+      </w:r>
+      <w:r>
+        <w:rPr>
+          <w:rStyle w:val="NormalTok"/>
+        </w:rPr>
+        <w:t xml:space="preserve"> </w:t>
+      </w:r>
+      <w:r>
+        <w:rPr>
+          <w:rStyle w:val="FunctionTok"/>
+        </w:rPr>
+        <w:t xml:space="preserve">train_test</w:t>
+      </w:r>
+      <w:r>
+        <w:rPr>
+          <w:rStyle w:val="NormalTok"/>
+        </w:rPr>
+        <w:t xml:space="preserve">(sr, iris)</w:t>
+      </w:r>
+      <w:r>
+        <w:br/>
+      </w:r>
+      <w:r>
+        <w:rPr>
+          <w:rStyle w:val="NormalTok"/>
+        </w:rPr>
+        <w:t xml:space="preserve">iris_train </w:t>
+      </w:r>
+      <w:r>
+        <w:rPr>
+          <w:rStyle w:val="OtherTok"/>
+        </w:rPr>
+        <w:t xml:space="preserve">&lt;-</w:t>
+      </w:r>
+      <w:r>
+        <w:rPr>
+          <w:rStyle w:val="NormalTok"/>
+        </w:rPr>
+        <w:t xml:space="preserve"> sr</w:t>
+      </w:r>
+      <w:r>
+        <w:rPr>
+          <w:rStyle w:val="SpecialCharTok"/>
+        </w:rPr>
+        <w:t xml:space="preserve">$</w:t>
+      </w:r>
+      <w:r>
+        <w:rPr>
+          <w:rStyle w:val="NormalTok"/>
+        </w:rPr>
+        <w:t xml:space="preserve">train</w:t>
+      </w:r>
+      <w:r>
+        <w:br/>
+      </w:r>
+      <w:r>
+        <w:rPr>
+          <w:rStyle w:val="NormalTok"/>
+        </w:rPr>
+        <w:t xml:space="preserve">iris_test </w:t>
+      </w:r>
+      <w:r>
+        <w:rPr>
+          <w:rStyle w:val="OtherTok"/>
+        </w:rPr>
+        <w:t xml:space="preserve">&lt;-</w:t>
+      </w:r>
+      <w:r>
+        <w:rPr>
+          <w:rStyle w:val="NormalTok"/>
+        </w:rPr>
+        <w:t xml:space="preserve"> sr</w:t>
+      </w:r>
+      <w:r>
+        <w:rPr>
+          <w:rStyle w:val="SpecialCharTok"/>
+        </w:rPr>
+        <w:t xml:space="preserve">$</w:t>
+      </w:r>
+      <w:r>
+        <w:rPr>
+          <w:rStyle w:val="NormalTok"/>
+        </w:rPr>
+        <w:t xml:space="preserve">test</w:t>
+      </w:r>
+      <w:r>
+        <w:br/>
+      </w:r>
+      <w:r>
+        <w:br/>
+      </w:r>
+      <w:r>
+        <w:rPr>
+          <w:rStyle w:val="NormalTok"/>
+        </w:rPr>
+        <w:t xml:space="preserve">model </w:t>
+      </w:r>
+      <w:r>
+        <w:rPr>
+          <w:rStyle w:val="OtherTok"/>
+        </w:rPr>
+        <w:t xml:space="preserve">&lt;-</w:t>
+      </w:r>
+      <w:r>
+        <w:rPr>
+          <w:rStyle w:val="NormalTok"/>
+        </w:rPr>
+        <w:t xml:space="preserve"> </w:t>
+      </w:r>
+      <w:r>
+        <w:rPr>
+          <w:rStyle w:val="FunctionTok"/>
+        </w:rPr>
+        <w:t xml:space="preserve">torch_cla_mlp</w:t>
+      </w:r>
+      <w:r>
+        <w:rPr>
+          <w:rStyle w:val="NormalTok"/>
+        </w:rPr>
+        <w:t xml:space="preserve">(</w:t>
+      </w:r>
+      <w:r>
+        <w:br/>
+      </w:r>
+      <w:r>
+        <w:rPr>
+          <w:rStyle w:val="NormalTok"/>
+        </w:rPr>
+        <w:t xml:space="preserve">  </w:t>
+      </w:r>
+      <w:r>
+        <w:rPr>
+          <w:rStyle w:val="AttributeTok"/>
+        </w:rPr>
+        <w:t xml:space="preserve">attribute =</w:t>
+      </w:r>
+      <w:r>
+        <w:rPr>
+          <w:rStyle w:val="NormalTok"/>
+        </w:rPr>
+        <w:t xml:space="preserve"> </w:t>
+      </w:r>
+      <w:r>
+        <w:rPr>
+          <w:rStyle w:val="StringTok"/>
+        </w:rPr>
+        <w:t xml:space="preserve">"Species"</w:t>
+      </w:r>
+      <w:r>
+        <w:rPr>
+          <w:rStyle w:val="NormalTok"/>
+        </w:rPr>
+        <w:t xml:space="preserve">,</w:t>
+      </w:r>
+      <w:r>
+        <w:br/>
+      </w:r>
+      <w:r>
+        <w:rPr>
+          <w:rStyle w:val="NormalTok"/>
+        </w:rPr>
+        <w:t xml:space="preserve">  </w:t>
+      </w:r>
+      <w:r>
+        <w:rPr>
+          <w:rStyle w:val="AttributeTok"/>
+        </w:rPr>
+        <w:t xml:space="preserve">slevels =</w:t>
+      </w:r>
+      <w:r>
+        <w:rPr>
+          <w:rStyle w:val="NormalTok"/>
+        </w:rPr>
+        <w:t xml:space="preserve"> slevels,</w:t>
+      </w:r>
+      <w:r>
+        <w:br/>
+      </w:r>
+      <w:r>
+        <w:rPr>
+          <w:rStyle w:val="NormalTok"/>
+        </w:rPr>
+        <w:t xml:space="preserve">  </w:t>
+      </w:r>
+      <w:r>
+        <w:rPr>
+          <w:rStyle w:val="AttributeTok"/>
+        </w:rPr>
+        <w:t xml:space="preserve">input_size =</w:t>
+      </w:r>
+      <w:r>
+        <w:rPr>
+          <w:rStyle w:val="NormalTok"/>
+        </w:rPr>
+        <w:t xml:space="preserve"> </w:t>
+      </w:r>
+      <w:r>
+        <w:rPr>
+          <w:rStyle w:val="DecValTok"/>
+        </w:rPr>
+        <w:t xml:space="preserve">4</w:t>
+      </w:r>
+      <w:r>
+        <w:rPr>
+          <w:rStyle w:val="DataTypeTok"/>
+        </w:rPr>
+        <w:t xml:space="preserve">L</w:t>
+      </w:r>
+      <w:r>
+        <w:rPr>
+          <w:rStyle w:val="NormalTok"/>
+        </w:rPr>
+        <w:t xml:space="preserve">,</w:t>
+      </w:r>
+      <w:r>
+        <w:br/>
+      </w:r>
+      <w:r>
+        <w:rPr>
+          <w:rStyle w:val="NormalTok"/>
+        </w:rPr>
+        <w:t xml:space="preserve">  </w:t>
+      </w:r>
+      <w:r>
+        <w:rPr>
+          <w:rStyle w:val="AttributeTok"/>
+        </w:rPr>
+        <w:t xml:space="preserve">hidden_sizes =</w:t>
+      </w:r>
+      <w:r>
+        <w:rPr>
+          <w:rStyle w:val="NormalTok"/>
+        </w:rPr>
+        <w:t xml:space="preserve"> </w:t>
+      </w:r>
+      <w:r>
+        <w:rPr>
+          <w:rStyle w:val="FunctionTok"/>
+        </w:rPr>
+        <w:t xml:space="preserve">c</w:t>
+      </w:r>
+      <w:r>
+        <w:rPr>
+          <w:rStyle w:val="NormalTok"/>
+        </w:rPr>
+        <w:t xml:space="preserve">(</w:t>
+      </w:r>
+      <w:r>
+        <w:rPr>
+          <w:rStyle w:val="DecValTok"/>
+        </w:rPr>
+        <w:t xml:space="preserve">16</w:t>
+      </w:r>
+      <w:r>
+        <w:rPr>
+          <w:rStyle w:val="DataTypeTok"/>
+        </w:rPr>
+        <w:t xml:space="preserve">L</w:t>
+      </w:r>
+      <w:r>
+        <w:rPr>
+          <w:rStyle w:val="NormalTok"/>
+        </w:rPr>
+        <w:t xml:space="preserve">, </w:t>
+      </w:r>
+      <w:r>
+        <w:rPr>
+          <w:rStyle w:val="DecValTok"/>
+        </w:rPr>
+        <w:t xml:space="preserve">8</w:t>
+      </w:r>
+      <w:r>
+        <w:rPr>
+          <w:rStyle w:val="DataTypeTok"/>
+        </w:rPr>
+        <w:t xml:space="preserve">L</w:t>
+      </w:r>
+      <w:r>
+        <w:rPr>
+          <w:rStyle w:val="NormalTok"/>
+        </w:rPr>
+        <w:t xml:space="preserve">),</w:t>
+      </w:r>
+      <w:r>
+        <w:br/>
+      </w:r>
+      <w:r>
+        <w:rPr>
+          <w:rStyle w:val="NormalTok"/>
+        </w:rPr>
+        <w:t xml:space="preserve">  </w:t>
+      </w:r>
+      <w:r>
+        <w:rPr>
+          <w:rStyle w:val="AttributeTok"/>
+        </w:rPr>
+        <w:t xml:space="preserve">num_classes =</w:t>
+      </w:r>
+      <w:r>
+        <w:rPr>
+          <w:rStyle w:val="NormalTok"/>
+        </w:rPr>
+        <w:t xml:space="preserve"> </w:t>
+      </w:r>
+      <w:r>
+        <w:rPr>
+          <w:rStyle w:val="DecValTok"/>
+        </w:rPr>
+        <w:t xml:space="preserve">3</w:t>
+      </w:r>
+      <w:r>
+        <w:rPr>
+          <w:rStyle w:val="DataTypeTok"/>
+        </w:rPr>
+        <w:t xml:space="preserve">L</w:t>
+      </w:r>
+      <w:r>
+        <w:rPr>
+          <w:rStyle w:val="NormalTok"/>
+        </w:rPr>
+        <w:t xml:space="preserve">,</w:t>
+      </w:r>
+      <w:r>
+        <w:br/>
+      </w:r>
+      <w:r>
+        <w:rPr>
+          <w:rStyle w:val="NormalTok"/>
+        </w:rPr>
+        <w:t xml:space="preserve">  </w:t>
+      </w:r>
+      <w:r>
+        <w:rPr>
+          <w:rStyle w:val="AttributeTok"/>
+        </w:rPr>
+        <w:t xml:space="preserve">epochs =</w:t>
+      </w:r>
+      <w:r>
+        <w:rPr>
+          <w:rStyle w:val="NormalTok"/>
+        </w:rPr>
+        <w:t xml:space="preserve"> </w:t>
+      </w:r>
+      <w:r>
+        <w:rPr>
+          <w:rStyle w:val="DecValTok"/>
+        </w:rPr>
+        <w:t xml:space="preserve">100</w:t>
+      </w:r>
+      <w:r>
+        <w:rPr>
+          <w:rStyle w:val="DataTypeTok"/>
+        </w:rPr>
+        <w:t xml:space="preserve">L</w:t>
+      </w:r>
+      <w:r>
+        <w:br/>
+      </w:r>
+      <w:r>
+        <w:rPr>
+          <w:rStyle w:val="NormalTok"/>
+        </w:rPr>
+        <w:t xml:space="preserve">)</w:t>
+      </w:r>
+      <w:r>
+        <w:br/>
+      </w:r>
+      <w:r>
+        <w:br/>
+      </w:r>
+      <w:r>
+        <w:rPr>
+          <w:rStyle w:val="NormalTok"/>
+        </w:rPr>
+        <w:t xml:space="preserve">model </w:t>
+      </w:r>
+      <w:r>
+        <w:rPr>
+          <w:rStyle w:val="OtherTok"/>
+        </w:rPr>
+        <w:t xml:space="preserve">&lt;-</w:t>
+      </w:r>
+      <w:r>
+        <w:rPr>
+          <w:rStyle w:val="NormalTok"/>
+        </w:rPr>
+        <w:t xml:space="preserve"> </w:t>
+      </w:r>
+      <w:r>
+        <w:rPr>
+          <w:rStyle w:val="FunctionTok"/>
+        </w:rPr>
+        <w:t xml:space="preserve">fit</w:t>
+      </w:r>
+      <w:r>
+        <w:rPr>
+          <w:rStyle w:val="NormalTok"/>
+        </w:rPr>
+        <w:t xml:space="preserve">(model, iris_train)</w:t>
+      </w:r>
+      <w:r>
+        <w:br/>
+      </w:r>
+      <w:r>
+        <w:rPr>
+          <w:rStyle w:val="NormalTok"/>
+        </w:rPr>
+        <w:t xml:space="preserve">train_prediction </w:t>
+      </w:r>
+      <w:r>
+        <w:rPr>
+          <w:rStyle w:val="OtherTok"/>
+        </w:rPr>
+        <w:t xml:space="preserve">&lt;-</w:t>
+      </w:r>
+      <w:r>
+        <w:rPr>
+          <w:rStyle w:val="NormalTok"/>
+        </w:rPr>
+        <w:t xml:space="preserve"> </w:t>
+      </w:r>
+      <w:r>
+        <w:rPr>
+          <w:rStyle w:val="FunctionTok"/>
+        </w:rPr>
+        <w:t xml:space="preserve">predict</w:t>
+      </w:r>
+      <w:r>
+        <w:rPr>
+          <w:rStyle w:val="NormalTok"/>
+        </w:rPr>
+        <w:t xml:space="preserve">(model, iris_train)</w:t>
+      </w:r>
+      <w:r>
+        <w:br/>
+      </w:r>
+      <w:r>
+        <w:br/>
+      </w:r>
+      <w:r>
+        <w:rPr>
+          <w:rStyle w:val="NormalTok"/>
+        </w:rPr>
+        <w:t xml:space="preserve">iris_train_predictand </w:t>
+      </w:r>
+      <w:r>
+        <w:rPr>
+          <w:rStyle w:val="OtherTok"/>
+        </w:rPr>
+        <w:t xml:space="preserve">&lt;-</w:t>
+      </w:r>
+      <w:r>
+        <w:rPr>
+          <w:rStyle w:val="NormalTok"/>
+        </w:rPr>
+        <w:t xml:space="preserve"> </w:t>
+      </w:r>
+      <w:r>
+        <w:rPr>
+          <w:rStyle w:val="FunctionTok"/>
+        </w:rPr>
+        <w:t xml:space="preserve">adjust_class_label</w:t>
+      </w:r>
+      <w:r>
+        <w:rPr>
+          <w:rStyle w:val="NormalTok"/>
+        </w:rPr>
+        <w:t xml:space="preserve">(iris_train[, </w:t>
+      </w:r>
+      <w:r>
+        <w:rPr>
+          <w:rStyle w:val="StringTok"/>
+        </w:rPr>
+        <w:t xml:space="preserve">"Species"</w:t>
+      </w:r>
+      <w:r>
+        <w:rPr>
+          <w:rStyle w:val="NormalTok"/>
+        </w:rPr>
+        <w:t xml:space="preserve">])</w:t>
+      </w:r>
+      <w:r>
+        <w:br/>
+      </w:r>
+      <w:r>
+        <w:rPr>
+          <w:rStyle w:val="NormalTok"/>
+        </w:rPr>
+        <w:t xml:space="preserve">train_eval </w:t>
+      </w:r>
+      <w:r>
+        <w:rPr>
+          <w:rStyle w:val="OtherTok"/>
+        </w:rPr>
+        <w:t xml:space="preserve">&lt;-</w:t>
+      </w:r>
+      <w:r>
+        <w:rPr>
+          <w:rStyle w:val="NormalTok"/>
+        </w:rPr>
+        <w:t xml:space="preserve"> </w:t>
+      </w:r>
+      <w:r>
+        <w:rPr>
+          <w:rStyle w:val="FunctionTok"/>
+        </w:rPr>
+        <w:t xml:space="preserve">evaluate</w:t>
+      </w:r>
+      <w:r>
+        <w:rPr>
+          <w:rStyle w:val="NormalTok"/>
+        </w:rPr>
+        <w:t xml:space="preserve">(model, iris_train_predictand, train_prediction)</w:t>
+      </w:r>
+      <w:r>
+        <w:br/>
+      </w:r>
+      <w:r>
+        <w:rPr>
+          <w:rStyle w:val="FunctionTok"/>
+        </w:rPr>
+        <w:t xml:space="preserve">print</w:t>
+      </w:r>
+      <w:r>
+        <w:rPr>
+          <w:rStyle w:val="NormalTok"/>
+        </w:rPr>
+        <w:t xml:space="preserve">(train_eval</w:t>
+      </w:r>
+      <w:r>
+        <w:rPr>
+          <w:rStyle w:val="SpecialCharTok"/>
+        </w:rPr>
+        <w:t xml:space="preserve">$</w:t>
+      </w:r>
+      <w:r>
+        <w:rPr>
+          <w:rStyle w:val="NormalTok"/>
+        </w:rPr>
+        <w:t xml:space="preserve">metrics)</w:t>
+      </w:r>
+    </w:p>
+    <w:p>
+      <w:pPr>
+        <w:pStyle w:val="SourceCode"/>
+      </w:pPr>
+      <w:r>
+        <w:rPr>
+          <w:rStyle w:val="VerbatimChar"/>
+        </w:rPr>
+        <w:t xml:space="preserve">## NULL</w:t>
+      </w:r>
+    </w:p>
+    <w:p>
+      <w:pPr>
+        <w:pStyle w:val="SourceCode"/>
+      </w:pPr>
+      <w:r>
+        <w:rPr>
+          <w:rStyle w:val="CommentTok"/>
+        </w:rPr>
+        <w:t xml:space="preserve"># Test prediction and evaluation</w:t>
+      </w:r>
+      <w:r>
+        <w:br/>
+      </w:r>
+      <w:r>
+        <w:rPr>
+          <w:rStyle w:val="NormalTok"/>
+        </w:rPr>
+        <w:t xml:space="preserve">test_prediction </w:t>
+      </w:r>
+      <w:r>
+        <w:rPr>
+          <w:rStyle w:val="OtherTok"/>
+        </w:rPr>
+        <w:t xml:space="preserve">&lt;-</w:t>
+      </w:r>
+      <w:r>
+        <w:rPr>
+          <w:rStyle w:val="NormalTok"/>
+        </w:rPr>
+        <w:t xml:space="preserve"> </w:t>
+      </w:r>
+      <w:r>
+        <w:rPr>
+          <w:rStyle w:val="FunctionTok"/>
+        </w:rPr>
+        <w:t xml:space="preserve">predict</w:t>
+      </w:r>
+      <w:r>
+        <w:rPr>
+          <w:rStyle w:val="NormalTok"/>
+        </w:rPr>
+        <w:t xml:space="preserve">(model, iris_test)</w:t>
+      </w:r>
+      <w:r>
+        <w:br/>
+      </w:r>
+      <w:r>
+        <w:br/>
+      </w:r>
+      <w:r>
+        <w:rPr>
+          <w:rStyle w:val="NormalTok"/>
+        </w:rPr>
+        <w:t xml:space="preserve">iris_test_predictand </w:t>
+      </w:r>
+      <w:r>
+        <w:rPr>
+          <w:rStyle w:val="OtherTok"/>
+        </w:rPr>
+        <w:t xml:space="preserve">&lt;-</w:t>
+      </w:r>
+      <w:r>
+        <w:rPr>
+          <w:rStyle w:val="NormalTok"/>
+        </w:rPr>
+        <w:t xml:space="preserve"> </w:t>
+      </w:r>
+      <w:r>
+        <w:rPr>
+          <w:rStyle w:val="FunctionTok"/>
+        </w:rPr>
+        <w:t xml:space="preserve">adjust_class_label</w:t>
+      </w:r>
+      <w:r>
+        <w:rPr>
+          <w:rStyle w:val="NormalTok"/>
+        </w:rPr>
+        <w:t xml:space="preserve">(iris_test[, </w:t>
+      </w:r>
+      <w:r>
+        <w:rPr>
+          <w:rStyle w:val="StringTok"/>
+        </w:rPr>
+        <w:t xml:space="preserve">"Species"</w:t>
+      </w:r>
+      <w:r>
+        <w:rPr>
+          <w:rStyle w:val="NormalTok"/>
+        </w:rPr>
+        <w:t xml:space="preserve">])</w:t>
+      </w:r>
+      <w:r>
+        <w:br/>
+      </w:r>
+      <w:r>
+        <w:rPr>
+          <w:rStyle w:val="NormalTok"/>
+        </w:rPr>
+        <w:t xml:space="preserve">test_eval </w:t>
+      </w:r>
+      <w:r>
+        <w:rPr>
+          <w:rStyle w:val="OtherTok"/>
+        </w:rPr>
+        <w:t xml:space="preserve">&lt;-</w:t>
+      </w:r>
+      <w:r>
+        <w:rPr>
+          <w:rStyle w:val="NormalTok"/>
+        </w:rPr>
+        <w:t xml:space="preserve"> </w:t>
+      </w:r>
+      <w:r>
+        <w:rPr>
+          <w:rStyle w:val="FunctionTok"/>
+        </w:rPr>
+        <w:t xml:space="preserve">evaluate</w:t>
+      </w:r>
+      <w:r>
+        <w:rPr>
+          <w:rStyle w:val="NormalTok"/>
+        </w:rPr>
+        <w:t xml:space="preserve">(model, iris_test_predictand, test_prediction)</w:t>
+      </w:r>
+      <w:r>
+        <w:br/>
+      </w:r>
+      <w:r>
+        <w:rPr>
+          <w:rStyle w:val="FunctionTok"/>
+        </w:rPr>
+        <w:t xml:space="preserve">print</w:t>
+      </w:r>
+      <w:r>
+        <w:rPr>
+          <w:rStyle w:val="NormalTok"/>
+        </w:rPr>
+        <w:t xml:space="preserve">(test_eval</w:t>
+      </w:r>
+      <w:r>
+        <w:rPr>
+          <w:rStyle w:val="SpecialCharTok"/>
+        </w:rPr>
+        <w:t xml:space="preserve">$</w:t>
+      </w:r>
+      <w:r>
+        <w:rPr>
+          <w:rStyle w:val="NormalTok"/>
+        </w:rPr>
+        <w:t xml:space="preserve">metrics)</w:t>
+      </w:r>
+    </w:p>
+    <w:p>
+      <w:pPr>
+        <w:pStyle w:val="SourceCode"/>
+      </w:pPr>
+      <w:r>
+        <w:rPr>
+          <w:rStyle w:val="VerbatimChar"/>
+        </w:rPr>
+        <w:t xml:space="preserve">## NULL</w:t>
+      </w:r>
+    </w:p>
+    <w:p>
+      <w:pPr>
+        <w:pStyle w:val="SourceCode"/>
+      </w:pPr>
+      <w:r>
+        <w:rPr>
+          <w:rStyle w:val="CommentTok"/>
+        </w:rPr>
+        <w:t xml:space="preserve"># Predicted probabilities</w:t>
+      </w:r>
+      <w:r>
+        <w:br/>
+      </w:r>
+      <w:r>
+        <w:rPr>
+          <w:rStyle w:val="NormalTok"/>
+        </w:rPr>
+        <w:t xml:space="preserve">probabilities </w:t>
+      </w:r>
+      <w:r>
+        <w:rPr>
+          <w:rStyle w:val="OtherTok"/>
+        </w:rPr>
+        <w:t xml:space="preserve">&lt;-</w:t>
+      </w:r>
+      <w:r>
+        <w:rPr>
+          <w:rStyle w:val="NormalTok"/>
+        </w:rPr>
+        <w:t xml:space="preserve"> </w:t>
+      </w:r>
+      <w:r>
+        <w:rPr>
+          <w:rStyle w:val="FunctionTok"/>
+        </w:rPr>
+        <w:t xml:space="preserve">predict_proba.torch_cla_mlp</w:t>
+      </w:r>
+      <w:r>
+        <w:rPr>
+          <w:rStyle w:val="NormalTok"/>
+        </w:rPr>
+        <w:t xml:space="preserve">(model, iris_test[, </w:t>
+      </w:r>
+      <w:r>
+        <w:rPr>
+          <w:rStyle w:val="SpecialCharTok"/>
+        </w:rPr>
+        <w:t xml:space="preserve">!</w:t>
+      </w:r>
+      <w:r>
+        <w:rPr>
+          <w:rStyle w:val="FunctionTok"/>
+        </w:rPr>
+        <w:t xml:space="preserve">names</w:t>
+      </w:r>
+      <w:r>
+        <w:rPr>
+          <w:rStyle w:val="NormalTok"/>
+        </w:rPr>
+        <w:t xml:space="preserve">(iris_test) </w:t>
+      </w:r>
+      <w:r>
+        <w:rPr>
+          <w:rStyle w:val="SpecialCharTok"/>
+        </w:rPr>
+        <w:t xml:space="preserve">%in%</w:t>
+      </w:r>
+      <w:r>
+        <w:rPr>
+          <w:rStyle w:val="NormalTok"/>
+        </w:rPr>
+        <w:t xml:space="preserve"> </w:t>
+      </w:r>
+      <w:r>
+        <w:rPr>
+          <w:rStyle w:val="StringTok"/>
+        </w:rPr>
+        <w:t xml:space="preserve">"Species"</w:t>
+      </w:r>
+      <w:r>
+        <w:rPr>
+          <w:rStyle w:val="NormalTok"/>
+        </w:rPr>
+        <w:t xml:space="preserve">])</w:t>
+      </w:r>
+      <w:r>
+        <w:br/>
+      </w:r>
+      <w:r>
+        <w:rPr>
+          <w:rStyle w:val="FunctionTok"/>
+        </w:rPr>
+        <w:t xml:space="preserve">head</w:t>
+      </w:r>
+      <w:r>
+        <w:rPr>
+          <w:rStyle w:val="NormalTok"/>
+        </w:rPr>
+        <w:t xml:space="preserve">(probabilities)</w:t>
+      </w:r>
+    </w:p>
+    <w:p>
+      <w:pPr>
+        <w:pStyle w:val="SourceCode"/>
+      </w:pPr>
+      <w:r>
+        <w:rPr>
+          <w:rStyle w:val="VerbatimChar"/>
+        </w:rPr>
+        <w:t xml:space="preserve">## [[1]]</w:t>
+      </w:r>
+      <w:r>
+        <w:br/>
+      </w:r>
+      <w:r>
+        <w:rPr>
+          <w:rStyle w:val="VerbatimChar"/>
+        </w:rPr>
+        <w:t xml:space="preserve">## [1] 0.78963542 0.16983734 0.04052724</w:t>
+      </w:r>
+      <w:r>
+        <w:br/>
+      </w:r>
+      <w:r>
+        <w:rPr>
+          <w:rStyle w:val="VerbatimChar"/>
+        </w:rPr>
+        <w:t xml:space="preserve">## </w:t>
+      </w:r>
+      <w:r>
+        <w:br/>
+      </w:r>
+      <w:r>
+        <w:rPr>
+          <w:rStyle w:val="VerbatimChar"/>
+        </w:rPr>
+        <w:t xml:space="preserve">## [[2]]</w:t>
+      </w:r>
+      <w:r>
+        <w:br/>
+      </w:r>
+      <w:r>
+        <w:rPr>
+          <w:rStyle w:val="VerbatimChar"/>
+        </w:rPr>
+        <w:t xml:space="preserve">## [1] 0.86709648 0.10983127 0.02307224</w:t>
+      </w:r>
+      <w:r>
+        <w:br/>
+      </w:r>
+      <w:r>
+        <w:rPr>
+          <w:rStyle w:val="VerbatimChar"/>
+        </w:rPr>
+        <w:t xml:space="preserve">## </w:t>
+      </w:r>
+      <w:r>
+        <w:br/>
+      </w:r>
+      <w:r>
+        <w:rPr>
+          <w:rStyle w:val="VerbatimChar"/>
+        </w:rPr>
+        <w:t xml:space="preserve">## [[3]]</w:t>
+      </w:r>
+      <w:r>
+        <w:br/>
+      </w:r>
+      <w:r>
+        <w:rPr>
+          <w:rStyle w:val="VerbatimChar"/>
+        </w:rPr>
+        <w:t xml:space="preserve">## [1] 0.83810884 0.13233009 0.02956106</w:t>
+      </w:r>
+      <w:r>
+        <w:br/>
+      </w:r>
+      <w:r>
+        <w:rPr>
+          <w:rStyle w:val="VerbatimChar"/>
+        </w:rPr>
+        <w:t xml:space="preserve">## </w:t>
+      </w:r>
+      <w:r>
+        <w:br/>
+      </w:r>
+      <w:r>
+        <w:rPr>
+          <w:rStyle w:val="VerbatimChar"/>
+        </w:rPr>
+        <w:t xml:space="preserve">## [[4]]</w:t>
+      </w:r>
+      <w:r>
+        <w:br/>
+      </w:r>
+      <w:r>
+        <w:rPr>
+          <w:rStyle w:val="VerbatimChar"/>
+        </w:rPr>
+        <w:t xml:space="preserve">## [1] 0.76860487 0.18626513 0.04512995</w:t>
+      </w:r>
+      <w:r>
+        <w:br/>
+      </w:r>
+      <w:r>
+        <w:rPr>
+          <w:rStyle w:val="VerbatimChar"/>
+        </w:rPr>
+        <w:t xml:space="preserve">## </w:t>
+      </w:r>
+      <w:r>
+        <w:br/>
+      </w:r>
+      <w:r>
+        <w:rPr>
+          <w:rStyle w:val="VerbatimChar"/>
+        </w:rPr>
+        <w:t xml:space="preserve">## [[5]]</w:t>
+      </w:r>
+      <w:r>
+        <w:br/>
+      </w:r>
+      <w:r>
+        <w:rPr>
+          <w:rStyle w:val="VerbatimChar"/>
+        </w:rPr>
+        <w:t xml:space="preserve">## [1] 0.87708026 0.10165987 0.02125977</w:t>
+      </w:r>
+      <w:r>
+        <w:br/>
+      </w:r>
+      <w:r>
+        <w:rPr>
+          <w:rStyle w:val="VerbatimChar"/>
+        </w:rPr>
+        <w:t xml:space="preserve">## </w:t>
+      </w:r>
+      <w:r>
+        <w:br/>
+      </w:r>
+      <w:r>
+        <w:rPr>
+          <w:rStyle w:val="VerbatimChar"/>
+        </w:rPr>
+        <w:t xml:space="preserve">## [[6]]</w:t>
+      </w:r>
+      <w:r>
+        <w:br/>
+      </w:r>
+      <w:r>
+        <w:rPr>
+          <w:rStyle w:val="VerbatimChar"/>
+        </w:rPr>
+        <w:t xml:space="preserve">## [1] 0.92117155 0.06553046 0.01329806</w:t>
       </w:r>
     </w:p>
     <w:p>

</xml_diff>

<commit_message>
Regenerate example outputs with local package install
</commit_message>
<xml_diff>
--- a/examples/classification/doc/torch_cla_mlp.docx
+++ b/examples/classification/doc/torch_cla_mlp.docx
@@ -841,7 +841,7 @@
         <w:rPr>
           <w:rStyle w:val="VerbatimChar"/>
         </w:rPr>
-        <w:t xml:space="preserve">## 1 0.9333333 39 81  0  0         1      1           1           1  1</w:t>
+        <w:t xml:space="preserve">## 1 0.9666667 39 81  0  0         1      1           1           1  1</w:t>
       </w:r>
     </w:p>
     <w:p>
@@ -1192,16 +1192,16 @@
         <w:rPr>
           <w:rStyle w:val="VerbatimChar"/>
         </w:rPr>
-        <w:t xml:space="preserve">##   accuracy TP TN FP FN precision recall sensitivity specificity f1</w:t>
-      </w:r>
-      <w:r>
-        <w:br/>
-      </w:r>
-      <w:r>
-        <w:rPr>
-          <w:rStyle w:val="VerbatimChar"/>
-        </w:rPr>
-        <w:t xml:space="preserve">## 1      0.9 11 19  0  0         1      1           1           1  1</w:t>
+        <w:t xml:space="preserve">##    accuracy TP TN FP FN precision recall sensitivity specificity f1</w:t>
+      </w:r>
+      <w:r>
+        <w:br/>
+      </w:r>
+      <w:r>
+        <w:rPr>
+          <w:rStyle w:val="VerbatimChar"/>
+        </w:rPr>
+        <w:t xml:space="preserve">## 1 0.9666667 11 19  0  0         1      1           1           1  1</w:t>
       </w:r>
     </w:p>
     <w:p>
@@ -1715,7 +1715,7 @@
               <a:graphicData uri="http://schemas.openxmlformats.org/drawingml/2006/picture">
                 <pic:pic>
                   <pic:nvPicPr>
-                    <pic:cNvPr descr="C:\Git\dal\daltoolboxdp\examples\classification\doc\torch_cla_mlp_files/553560553026a646c34c1e13a2d5af2f35052f84.png" id="11" name="Picture"/>
+                    <pic:cNvPr descr="C:\Git\dal\daltoolboxdp\examples\classification\doc\torch_cla_mlp_files/43c317363bbc324b1c41441314d4bbe7810ceaa3.png" id="11" name="Picture"/>
                     <pic:cNvPicPr>
                       <a:picLocks noChangeArrowheads="1" noChangeAspect="1"/>
                     </pic:cNvPicPr>
@@ -1866,7 +1866,7 @@
         <w:rPr>
           <w:rStyle w:val="VerbatimChar"/>
         </w:rPr>
-        <w:t xml:space="preserve">## [1] 0.87930208 0.09862933 0.02206862</w:t>
+        <w:t xml:space="preserve">## [1] 0.906842649 0.084879734 0.008277592</w:t>
       </w:r>
       <w:r>
         <w:br/>
@@ -1893,7 +1893,7 @@
         <w:rPr>
           <w:rStyle w:val="VerbatimChar"/>
         </w:rPr>
-        <w:t xml:space="preserve">## [1] 0.92985880 0.05897300 0.01116814</w:t>
+        <w:t xml:space="preserve">## [1] 0.942767680 0.053357624 0.003874781</w:t>
       </w:r>
       <w:r>
         <w:br/>
@@ -1920,7 +1920,7 @@
         <w:rPr>
           <w:rStyle w:val="VerbatimChar"/>
         </w:rPr>
-        <w:t xml:space="preserve">## [1] 0.90859592 0.07645752 0.01494653</w:t>
+        <w:t xml:space="preserve">## [1] 0.933061779 0.062121402 0.004816834</w:t>
       </w:r>
       <w:r>
         <w:br/>
@@ -1947,7 +1947,7 @@
         <w:rPr>
           <w:rStyle w:val="VerbatimChar"/>
         </w:rPr>
-        <w:t xml:space="preserve">## [1] 0.86186802 0.11176000 0.02637196</w:t>
+        <w:t xml:space="preserve">## [1] 0.904949248 0.086110093 0.008940582</w:t>
       </w:r>
       <w:r>
         <w:br/>
@@ -1974,7 +1974,7 @@
         <w:rPr>
           <w:rStyle w:val="VerbatimChar"/>
         </w:rPr>
-        <w:t xml:space="preserve">## [1] 0.93117547 0.05878445 0.01004000</w:t>
+        <w:t xml:space="preserve">## [1] 0.951331794 0.045821328 0.002846869</w:t>
       </w:r>
       <w:r>
         <w:br/>
@@ -2001,7 +2001,7 @@
         <w:rPr>
           <w:rStyle w:val="VerbatimChar"/>
         </w:rPr>
-        <w:t xml:space="preserve">## [1] 0.958710670 0.035582062 0.005707246</w:t>
+        <w:t xml:space="preserve">## [1] 0.955557585 0.042090207 0.002352145</w:t>
       </w:r>
     </w:p>
     <w:p>

</xml_diff>

<commit_message>
Refresh docs and examples for MLP epoch defaults
</commit_message>
<xml_diff>
--- a/examples/classification/doc/torch_cla_mlp.docx
+++ b/examples/classification/doc/torch_cla_mlp.docx
@@ -599,6 +599,51 @@
         <w:t xml:space="preserve">L</w:t>
       </w:r>
       <w:r>
+        <w:rPr>
+          <w:rStyle w:val="NormalTok"/>
+        </w:rPr>
+        <w:t xml:space="preserve">,</w:t>
+      </w:r>
+      <w:r>
+        <w:br/>
+      </w:r>
+      <w:r>
+        <w:rPr>
+          <w:rStyle w:val="NormalTok"/>
+        </w:rPr>
+        <w:t xml:space="preserve">  </w:t>
+      </w:r>
+      <w:r>
+        <w:rPr>
+          <w:rStyle w:val="AttributeTok"/>
+        </w:rPr>
+        <w:t xml:space="preserve">epochs =</w:t>
+      </w:r>
+      <w:r>
+        <w:rPr>
+          <w:rStyle w:val="NormalTok"/>
+        </w:rPr>
+        <w:t xml:space="preserve"> </w:t>
+      </w:r>
+      <w:r>
+        <w:rPr>
+          <w:rStyle w:val="DecValTok"/>
+        </w:rPr>
+        <w:t xml:space="preserve">1000</w:t>
+      </w:r>
+      <w:r>
+        <w:rPr>
+          <w:rStyle w:val="DataTypeTok"/>
+        </w:rPr>
+        <w:t xml:space="preserve">L</w:t>
+      </w:r>
+      <w:r>
+        <w:rPr>
+          <w:rStyle w:val="NormalTok"/>
+        </w:rPr>
+        <w:t xml:space="preserve">  </w:t>
+      </w:r>
+      <w:r>
         <w:br/>
       </w:r>
       <w:r>
@@ -793,7 +838,7 @@
         <w:rPr>
           <w:rStyle w:val="VerbatimChar"/>
         </w:rPr>
-        <w:t xml:space="preserve">##    accuracy TP TN FP FN precision recall sensitivity specificity  f1</w:t>
+        <w:t xml:space="preserve">##   accuracy TP TN FP FN precision recall sensitivity specificity f1</w:t>
       </w:r>
       <w:r>
         <w:br/>
@@ -802,7 +847,7 @@
         <w:rPr>
           <w:rStyle w:val="VerbatimChar"/>
         </w:rPr>
-        <w:t xml:space="preserve">## 1 0.3583333  0 81  0 39       NaN      0           0           1 NaN</w:t>
+        <w:t xml:space="preserve">## 1    0.975 39 81  0  0         1      1           1           1  1</w:t>
       </w:r>
     </w:p>
     <w:p>
@@ -831,7 +876,19 @@
         <w:t xml:space="preserve"> </w:t>
       </w:r>
       <w:r>
-        <w:t xml:space="preserve">to use the default value, keep</w:t>
+        <w:t xml:space="preserve">to use the default value of</w:t>
+      </w:r>
+      <w:r>
+        <w:t xml:space="preserve"> </w:t>
+      </w:r>
+      <w:r>
+        <w:rPr>
+          <w:rStyle w:val="VerbatimChar"/>
+        </w:rPr>
+        <w:t xml:space="preserve">100L</w:t>
+      </w:r>
+      <w:r>
+        <w:t xml:space="preserve">, keep</w:t>
       </w:r>
       <w:r>
         <w:t xml:space="preserve"> </w:t>
@@ -1156,7 +1213,7 @@
         <w:rPr>
           <w:rStyle w:val="VerbatimChar"/>
         </w:rPr>
-        <w:t xml:space="preserve">##    accuracy TP TN FP FN precision recall sensitivity specificity  f1</w:t>
+        <w:t xml:space="preserve">##   accuracy TP TN FP FN precision recall sensitivity specificity f1</w:t>
       </w:r>
       <w:r>
         <w:br/>
@@ -1165,7 +1222,7 @@
         <w:rPr>
           <w:rStyle w:val="VerbatimChar"/>
         </w:rPr>
-        <w:t xml:space="preserve">## 1 0.2333333  0 19  0 11       NaN      0           0           1 NaN</w:t>
+        <w:t xml:space="preserve">## 1        1 11 19  0  0         1      1           1           1  1</w:t>
       </w:r>
     </w:p>
     <w:p>
@@ -1679,7 +1736,7 @@
               <a:graphicData uri="http://schemas.openxmlformats.org/drawingml/2006/picture">
                 <pic:pic>
                   <pic:nvPicPr>
-                    <pic:cNvPr descr="C:\Git\dal\daltoolboxdp\examples\classification\doc\torch_cla_mlp_files/6ba1770b221d2577e793bb87dc1c1f5d556641ef.png" id="11" name="Picture"/>
+                    <pic:cNvPr descr="C:\Git\dal\daltoolboxdp\examples\classification\doc\torch_cla_mlp_files/b715f30b15b326d3e05820bde9d374a370189eff.png" id="11" name="Picture"/>
                     <pic:cNvPicPr>
                       <a:picLocks noChangeArrowheads="1" noChangeAspect="1"/>
                     </pic:cNvPicPr>

</xml_diff>